<commit_message>
Abstract: lead with the competence intuition; add Zenodo DOI availability
Promote the "detector is a model of where normal data lies, so its grasp of
the normal manifold sets its quality" intuition into the abstract's opening,
absorbing the old closing sentence. Split the stacked appositives and
disambiguate the oracle and fixed-detector comparisons for readability.
Add an unnumbered Data and code availability section citing the Zenodo
deposit (DOI 10.5281/zenodo.22269286).

Co-Authored-By: Claude Opus 4.8 <noreply@anthropic.com>
</commit_message>
<xml_diff>
--- a/docs/nomas-2col.docx
+++ b/docs/nomas-2col.docx
@@ -2,7 +2,7 @@
 <file path=word/document.xml><?xml version="1.0" encoding="utf-8"?>
 <w:document xmlns:w="http://schemas.openxmlformats.org/wordprocessingml/2006/main" xmlns:m="http://schemas.openxmlformats.org/officeDocument/2006/math" xmlns:r="http://schemas.openxmlformats.org/officeDocument/2006/relationships" xmlns:o="urn:schemas-microsoft-com:office:office" xmlns:v="urn:schemas-microsoft-com:vml" xmlns:w10="urn:schemas-microsoft-com:office:word" xmlns:a="http://schemas.openxmlformats.org/drawingml/2006/main" xmlns:pic="http://schemas.openxmlformats.org/drawingml/2006/picture" xmlns:wp="http://schemas.openxmlformats.org/drawingml/2006/wordprocessingDrawing">
   <w:body>
-    <w:bookmarkStart w:id="70" w:name="X21bb77f71b307878073509d2b74b03e450e4e60"/>
+    <w:bookmarkStart w:id="73" w:name="X21bb77f71b307878073509d2b74b03e450e4e60"/>
     <w:p>
       <w:pPr>
         <w:pStyle w:val="Title"/>
@@ -162,7 +162,7 @@
         <w:rPr>
           <w:color w:val="000000"/>
         </w:rPr>
-        <w:t xml:space="preserve">Choosing an anomaly detector for a new dataset is a chicken-and-egg problem: comparing detectors by held-out ROC-AUC requires labeled anomalies, which unsupervised deployments lack. NoMaS ranks a panel of detectors from the unlabeled data alone: cluster the data, hold out a few clusters as stand-in anomalies, fit each detector on the rest, and score how well it flags the held-out clusters, its held-out-cluster separability. Averaged over many held-out clusters, this separability is a label-free estimate of how well a detector has resolved the normal manifold, the competence it needs to separate true anomalies from normal. We evaluate a selector by</w:t>
+        <w:t xml:space="preserve">Choosing an anomaly detector for a new dataset is a chicken-and-egg problem: comparing detectors by held-out ROC-AUC requires labeled anomalies, which unsupervised deployments lack. NoMaS starts from one observation: every anomaly detector is at heart a model of where the normal data lies, so a detector is only as good as its grasp of the normal manifold; that grasp is the same competence it needs to separate true anomalies from normal data. NoMaS therefore ranks a panel of detectors from the unlabeled data alone. It clusters the data, holds out a few clusters as stand-in anomalies, fits each detector on the rest, and scores the detector by how well it flags the held-out clusters; we call this score its held-out-cluster separability. Averaged over many held-out clusters, separability is a label-free readout of that grasp. We evaluate a selector by</w:t>
       </w:r>
       <w:r>
         <w:rPr>
@@ -182,7 +182,7 @@
         <w:rPr>
           <w:color w:val="000000"/>
         </w:rPr>
-        <w:t xml:space="preserve">, the AUC gap between the best available detector and the one it picks.</w:t>
+        <w:t xml:space="preserve">: the AUC gap between the best available detector and the one it picks.</w:t>
       </w:r>
     </w:p>
     <w:p>
@@ -198,7 +198,7 @@
         <w:rPr>
           <w:color w:val="000000"/>
         </w:rPr>
-        <w:t xml:space="preserve">We develop NoMaS on a benchmark of 69 datasets spanning tabular, image, text, and time-series modalities, where a label-free self-calibration cuts regret 78 to 93% below a random pick, within 0.01 AUC of a labels-based oracle. The signal comes from the geometry of normal data alone: regret is unchanged at 0% contamination, so NoMaS needs no anomalies in its input to find the detector that will catch them. Against the harder bar of committing to one detector, it beats the Isolation Forest default and matches the best fixed detector without knowing in advance which one it is.</w:t>
+        <w:t xml:space="preserve">We develop NoMaS on a benchmark of 69 datasets spanning tabular, image, text, and time-series modalities. There, a label-free self-calibration cuts regret 78 to 93% below a random pick, landing within 0.01 AUC of a labels-based oracle. The signal comes from the geometry of normal data alone: regret is unchanged at 0% contamination, so NoMaS needs no anomalies in its input to find the detector that will catch them. Measured against the harder bar set by strategies that commit to one detector in advance, it beats the Isolation Forest default and matches the best fixed detector without knowing in advance which one it is.</w:t>
       </w:r>
     </w:p>
     <w:p>
@@ -214,7 +214,7 @@
         <w:rPr>
           <w:color w:val="000000"/>
         </w:rPr>
-        <w:t xml:space="preserve">To test generalization, we freeze the method and run it, with no further tuning, on 187 previously-unseen tabular datasets from OddBench. There it attains the lowest regret of any label-free strategy and the most robust skill across benchmarks; because the best fixed detector changes from one benchmark to the next, no advance choice is safe, and NoMaS tracks the winner on its own. One limit remains, datasets whose best detector is global rather than local, which a marginal-tail variant partly closes. We release the code, benchmark, and per-dataset results.</w:t>
+        <w:t xml:space="preserve">To test generalization, we freeze the method and run it, with no further tuning, on 187 previously-unseen tabular datasets from OddBench. There it attains the lowest regret of any label-free strategy and the most robust skill across benchmarks; because the best fixed detector changes from one benchmark to the next, no advance choice is safe, and NoMaS tracks the winner on its own. One limit remains: datasets whose best detector is global rather than local. A marginal-tail variant partly closes it. We release the code, benchmark, and per-dataset results.</w:t>
       </w:r>
     </w:p>
     <w:p>
@@ -14381,7 +14381,7 @@
       </w:r>
     </w:p>
     <w:bookmarkEnd w:id="36"/>
-    <w:bookmarkStart w:id="42" w:name="X6cad7445b6ef744a8d56b466b3d8dc06a942694"/>
+    <w:bookmarkStart w:id="39" w:name="data-and-code-availability"/>
     <w:p>
       <w:pPr>
         <w:pStyle w:val="Heading2"/>
@@ -14393,10 +14393,81 @@
         <w:rPr>
           <w:color w:val="000000"/>
         </w:rPr>
+        <w:t xml:space="preserve">Data and code availability</w:t>
+      </w:r>
+    </w:p>
+    <w:p>
+      <w:pPr>
+        <w:pStyle w:val="FirstParagraph"/>
+        <w:jc w:val="both"/>
+        <w:keepNext w:val="0"/>
+        <w:keepLines w:val="0"/>
+        <w:widowControl w:val="1"/>
+      </w:pPr>
+      <w:r>
+        <w:rPr>
+          <w:color w:val="000000"/>
+        </w:rPr>
+        <w:t xml:space="preserve">The NoMaS source, the reproduction scripts, and the per-dataset result tables behind every table and figure are archived at Zenodo, DOI</w:t>
+      </w:r>
+      <w:r>
+        <w:rPr>
+          <w:color w:val="000000"/>
+        </w:rPr>
+        <w:t xml:space="preserve"> </w:t>
+      </w:r>
+      <w:hyperlink r:id="rId37">
+        <w:r>
+          <w:rPr>
+            <w:rStyle w:val="Hyperlink"/>
+          </w:rPr>
+          <w:t xml:space="preserve">10.5281/zenodo.22269286</w:t>
+        </w:r>
+      </w:hyperlink>
+      <w:r>
+        <w:rPr>
+          <w:color w:val="000000"/>
+        </w:rPr>
+        <w:t xml:space="preserve">, and developed at</w:t>
+      </w:r>
+      <w:r>
+        <w:rPr>
+          <w:color w:val="000000"/>
+        </w:rPr>
+        <w:t xml:space="preserve"> </w:t>
+      </w:r>
+      <w:hyperlink r:id="rId38">
+        <w:r>
+          <w:rPr>
+            <w:rStyle w:val="Hyperlink"/>
+          </w:rPr>
+          <w:t xml:space="preserve">github.com/ApartsinProjects/NoMaS</w:t>
+        </w:r>
+      </w:hyperlink>
+      <w:r>
+        <w:rPr>
+          <w:color w:val="000000"/>
+        </w:rPr>
+        <w:t xml:space="preserve">. The benchmark corpora (ADBench, DAMI, OddBench) are third-party and are retrieved by the included fetch scripts.</w:t>
+      </w:r>
+    </w:p>
+    <w:bookmarkEnd w:id="39"/>
+    <w:bookmarkStart w:id="45" w:name="X6cad7445b6ef744a8d56b466b3d8dc06a942694"/>
+    <w:p>
+      <w:pPr>
+        <w:pStyle w:val="Heading2"/>
+        <w:keepNext/>
+        <w:keepLines/>
+        <w:widowControl w:val="1"/>
+      </w:pPr>
+      <w:r>
+        <w:rPr>
+          <w:color w:val="000000"/>
+        </w:rPr>
         <w:t xml:space="preserve">Appendix A. Ablations and per-dataset behavior</w:t>
       </w:r>
     </w:p>
-    <w:bookmarkStart w:id="37" w:name="X80ac8a6d573c514303622ce95145bcc97b35326"/>
+    <w:bookmarkStart w:id="40" w:name="X80ac8a6d573c514303622ce95145bcc97b35326"/>
     <w:p>
       <w:pPr>
         <w:pStyle w:val="Heading3"/>
@@ -16152,8 +16223,8 @@
         <w:t xml:space="preserve">Mean, Borda over per-subset ranks, and variance-weighted mean all fall within ±0.02 ρ. Ship the simplest option.</w:t>
       </w:r>
     </w:p>
-    <w:bookmarkEnd w:id="37"/>
-    <w:bookmarkStart w:id="41" w:name="Xea31230ad33a9ed880aeb17ba6e96405a3004d4"/>
+    <w:bookmarkEnd w:id="40"/>
+    <w:bookmarkStart w:id="44" w:name="Xea31230ad33a9ed880aeb17ba6e96405a3004d4"/>
     <w:p>
       <w:pPr>
         <w:pStyle w:val="Heading3"/>
@@ -16184,18 +16255,18 @@
           <wp:inline>
             <wp:extent cx="2984601" cy="5223051"/>
             <wp:effectExtent b="0" l="0" r="0" t="0"/>
-            <wp:docPr descr="Per-dataset scatter of NoMaS-predicted rank against true rank" title="" id="39" name="Picture"/>
+            <wp:docPr descr="Per-dataset scatter of NoMaS-predicted rank against true rank" title="" id="42" name="Picture"/>
             <a:graphic>
               <a:graphicData uri="http://schemas.openxmlformats.org/drawingml/2006/picture">
                 <pic:pic>
                   <pic:nvPicPr>
-                    <pic:cNvPr descr="figures/fig3_scatter.png" id="40" name="Picture"/>
+                    <pic:cNvPr descr="figures/fig3_scatter.png" id="43" name="Picture"/>
                     <pic:cNvPicPr>
                       <a:picLocks noChangeArrowheads="1" noChangeAspect="1"/>
                     </pic:cNvPicPr>
                   </pic:nvPicPr>
                   <pic:blipFill>
-                    <a:blip r:embed="rId38"/>
+                    <a:blip r:embed="rId41"/>
                     <a:stretch>
                       <a:fillRect/>
                     </a:stretch>
@@ -16251,9 +16322,9 @@
         <w:t xml:space="preserve">Predicted rank (NoMaS) vs true rank per detector, one panel per dataset. Dashed grey identity line. Datasets where the scatter clusters near the diagonal (vowels, magic.gamma, optdigits, satellite, Pima, PageBlocks, satimage-2, Waveform) contribute the bulk of the aggregate signal. Datasets with saturated true AUC (WBC, WDBC, mammography) show noise-dominated tie-breaking.</w:t>
       </w:r>
     </w:p>
-    <w:bookmarkEnd w:id="41"/>
-    <w:bookmarkEnd w:id="42"/>
-    <w:bookmarkStart w:id="45" w:name="appendix-b-robustness-checks"/>
+    <w:bookmarkEnd w:id="44"/>
+    <w:bookmarkEnd w:id="45"/>
+    <w:bookmarkStart w:id="48" w:name="appendix-b-robustness-checks"/>
     <w:p>
       <w:pPr>
         <w:pStyle w:val="Heading2"/>
@@ -16268,7 +16339,7 @@
         <w:t xml:space="preserve">Appendix B. Robustness checks</w:t>
       </w:r>
     </w:p>
-    <w:bookmarkStart w:id="43" w:name="Xdeccc8a5f1edf0810f65fee6f7ac5156753c2d5"/>
+    <w:bookmarkStart w:id="46" w:name="Xdeccc8a5f1edf0810f65fee6f7ac5156753c2d5"/>
     <w:p>
       <w:pPr>
         <w:pStyle w:val="Heading3"/>
@@ -17435,8 +17506,8 @@
         <w:t xml:space="preserve">The ranking is stable to detector-panel choice. Dropping the strongest single detector (IForest) is the largest cost and still leaves ρ = 0.557, above the consensus baseline by ~0.7. Removing OCSVM or HBOS improves ρ marginally, indicating they contribute more noise than signal to the pseudo-ranking under this panel and dataset mix; the OCSVM row is the panel-removal check referenced in Section 4.</w:t>
       </w:r>
     </w:p>
-    <w:bookmarkEnd w:id="43"/>
-    <w:bookmarkStart w:id="44" w:name="b2-deep-detectors"/>
+    <w:bookmarkEnd w:id="46"/>
+    <w:bookmarkStart w:id="47" w:name="b2-deep-detectors"/>
     <w:p>
       <w:pPr>
         <w:pStyle w:val="Heading3"/>
@@ -18203,9 +18274,9 @@
         <w:t xml:space="preserve">regret@1 (absolute, in AUC points; parenthetical is the reduction versus random) on the same datasets and config, classical vs deep-augmented panel, single seed. Adding two deep detectors leaves the reduction at 85-94%. The small absolute rise (e.g. 0.009 to 0.015 on tabular) reflects a harder ranking problem, not a failure: there are two more detectors to rank and they are competitive, taking the true-best slot on three datasets (AutoEncoder once, DeepSVDD twice), so a near-miss between strong detectors costs a little regret while remaining far below random.</w:t>
       </w:r>
     </w:p>
-    <w:bookmarkEnd w:id="44"/>
-    <w:bookmarkEnd w:id="45"/>
-    <w:bookmarkStart w:id="69" w:name="references"/>
+    <w:bookmarkEnd w:id="47"/>
+    <w:bookmarkEnd w:id="48"/>
+    <w:bookmarkStart w:id="72" w:name="references"/>
     <w:p>
       <w:pPr>
         <w:pStyle w:val="ReferencesHeading"/>
@@ -18271,7 +18342,7 @@
         </w:rPr>
         <w:t xml:space="preserve"> </w:t>
       </w:r>
-      <w:hyperlink r:id="rId46">
+      <w:hyperlink r:id="rId49">
         <w:r>
           <w:rPr>
             <w:rStyle w:val="Hyperlink"/>
@@ -18336,7 +18407,7 @@
         </w:rPr>
         <w:t xml:space="preserve"> </w:t>
       </w:r>
-      <w:hyperlink r:id="rId47">
+      <w:hyperlink r:id="rId50">
         <w:r>
           <w:rPr>
             <w:rStyle w:val="Hyperlink"/>
@@ -18401,7 +18472,7 @@
         </w:rPr>
         <w:t xml:space="preserve"> </w:t>
       </w:r>
-      <w:hyperlink r:id="rId48">
+      <w:hyperlink r:id="rId51">
         <w:r>
           <w:rPr>
             <w:rStyle w:val="Hyperlink"/>
@@ -18421,7 +18492,7 @@
         </w:rPr>
         <w:t xml:space="preserve"> </w:t>
       </w:r>
-      <w:hyperlink r:id="rId49">
+      <w:hyperlink r:id="rId52">
         <w:r>
           <w:rPr>
             <w:rStyle w:val="Hyperlink"/>
@@ -18492,7 +18563,7 @@
         </w:rPr>
         <w:t xml:space="preserve"> </w:t>
       </w:r>
-      <w:hyperlink r:id="rId50">
+      <w:hyperlink r:id="rId53">
         <w:r>
           <w:rPr>
             <w:rStyle w:val="Hyperlink"/>
@@ -18557,7 +18628,7 @@
         </w:rPr>
         <w:t xml:space="preserve"> </w:t>
       </w:r>
-      <w:hyperlink r:id="rId51">
+      <w:hyperlink r:id="rId54">
         <w:r>
           <w:rPr>
             <w:rStyle w:val="Hyperlink"/>
@@ -18628,7 +18699,7 @@
         </w:rPr>
         <w:t xml:space="preserve"> </w:t>
       </w:r>
-      <w:hyperlink r:id="rId52">
+      <w:hyperlink r:id="rId55">
         <w:r>
           <w:rPr>
             <w:rStyle w:val="Hyperlink"/>
@@ -18699,7 +18770,7 @@
         </w:rPr>
         <w:t xml:space="preserve"> </w:t>
       </w:r>
-      <w:hyperlink r:id="rId53">
+      <w:hyperlink r:id="rId56">
         <w:r>
           <w:rPr>
             <w:rStyle w:val="Hyperlink"/>
@@ -18764,7 +18835,7 @@
         </w:rPr>
         <w:t xml:space="preserve"> </w:t>
       </w:r>
-      <w:hyperlink r:id="rId54">
+      <w:hyperlink r:id="rId57">
         <w:r>
           <w:rPr>
             <w:rStyle w:val="Hyperlink"/>
@@ -18829,7 +18900,7 @@
         </w:rPr>
         <w:t xml:space="preserve"> </w:t>
       </w:r>
-      <w:hyperlink r:id="rId55">
+      <w:hyperlink r:id="rId58">
         <w:r>
           <w:rPr>
             <w:rStyle w:val="Hyperlink"/>
@@ -18900,7 +18971,7 @@
         </w:rPr>
         <w:t xml:space="preserve"> </w:t>
       </w:r>
-      <w:hyperlink r:id="rId56">
+      <w:hyperlink r:id="rId59">
         <w:r>
           <w:rPr>
             <w:rStyle w:val="Hyperlink"/>
@@ -18965,7 +19036,7 @@
         </w:rPr>
         <w:t xml:space="preserve"> </w:t>
       </w:r>
-      <w:hyperlink r:id="rId57">
+      <w:hyperlink r:id="rId60">
         <w:r>
           <w:rPr>
             <w:rStyle w:val="Hyperlink"/>
@@ -19030,7 +19101,7 @@
         </w:rPr>
         <w:t xml:space="preserve"> </w:t>
       </w:r>
-      <w:hyperlink r:id="rId58">
+      <w:hyperlink r:id="rId61">
         <w:r>
           <w:rPr>
             <w:rStyle w:val="Hyperlink"/>
@@ -19101,7 +19172,7 @@
         </w:rPr>
         <w:t xml:space="preserve"> </w:t>
       </w:r>
-      <w:hyperlink r:id="rId59">
+      <w:hyperlink r:id="rId62">
         <w:r>
           <w:rPr>
             <w:rStyle w:val="Hyperlink"/>
@@ -19166,7 +19237,7 @@
         </w:rPr>
         <w:t xml:space="preserve"> </w:t>
       </w:r>
-      <w:hyperlink r:id="rId60">
+      <w:hyperlink r:id="rId63">
         <w:r>
           <w:rPr>
             <w:rStyle w:val="Hyperlink"/>
@@ -19237,7 +19308,7 @@
         </w:rPr>
         <w:t xml:space="preserve"> </w:t>
       </w:r>
-      <w:hyperlink r:id="rId61">
+      <w:hyperlink r:id="rId64">
         <w:r>
           <w:rPr>
             <w:rStyle w:val="Hyperlink"/>
@@ -19308,7 +19379,7 @@
         </w:rPr>
         <w:t xml:space="preserve"> </w:t>
       </w:r>
-      <w:hyperlink r:id="rId62">
+      <w:hyperlink r:id="rId65">
         <w:r>
           <w:rPr>
             <w:rStyle w:val="Hyperlink"/>
@@ -19379,7 +19450,7 @@
         </w:rPr>
         <w:t xml:space="preserve"> </w:t>
       </w:r>
-      <w:hyperlink r:id="rId63">
+      <w:hyperlink r:id="rId66">
         <w:r>
           <w:rPr>
             <w:rStyle w:val="Hyperlink"/>
@@ -19450,7 +19521,7 @@
         </w:rPr>
         <w:t xml:space="preserve"> </w:t>
       </w:r>
-      <w:hyperlink r:id="rId64">
+      <w:hyperlink r:id="rId67">
         <w:r>
           <w:rPr>
             <w:rStyle w:val="Hyperlink"/>
@@ -19515,7 +19586,7 @@
         </w:rPr>
         <w:t xml:space="preserve"> </w:t>
       </w:r>
-      <w:hyperlink r:id="rId65">
+      <w:hyperlink r:id="rId68">
         <w:r>
           <w:rPr>
             <w:rStyle w:val="Hyperlink"/>
@@ -19580,7 +19651,7 @@
         </w:rPr>
         <w:t xml:space="preserve"> </w:t>
       </w:r>
-      <w:hyperlink r:id="rId66">
+      <w:hyperlink r:id="rId69">
         <w:r>
           <w:rPr>
             <w:rStyle w:val="Hyperlink"/>
@@ -19645,7 +19716,7 @@
         </w:rPr>
         <w:t xml:space="preserve"> </w:t>
       </w:r>
-      <w:hyperlink r:id="rId67">
+      <w:hyperlink r:id="rId70">
         <w:r>
           <w:rPr>
             <w:rStyle w:val="Hyperlink"/>
@@ -19710,7 +19781,7 @@
         </w:rPr>
         <w:t xml:space="preserve"> </w:t>
       </w:r>
-      <w:hyperlink r:id="rId68">
+      <w:hyperlink r:id="rId71">
         <w:r>
           <w:rPr>
             <w:rStyle w:val="Hyperlink"/>
@@ -19750,8 +19821,8 @@
         <w:t xml:space="preserve">NoMaS v1 · Anomaly Detector Model Selection by Normal Manifold Separability</w:t>
       </w:r>
     </w:p>
-    <w:bookmarkEnd w:id="69"/>
-    <w:bookmarkEnd w:id="70"/>
+    <w:bookmarkEnd w:id="72"/>
+    <w:bookmarkEnd w:id="73"/>
     <w:sectPr>
       <w:type w:val="continuous"/>
       <w:pgSz w:h="15840" w:w="12240"/>

</xml_diff>

<commit_message>
Fix table captions stranded outside their floats in the LaTeX build
All 10 table captions were emitted as body paragraphs after \end{table}
(the house style captions tables with a div after </table>, which pandoc
leaves outside the float). Floats then migrated away from their captions,
so captions read as stray sentences in the prose and tables surfaced
uncaptioned. Fixed upstream in html2tex; all 15 floats now carry their
caption inside, verified in the rendered PDF (each label exactly once, on
its float's page, text intact).

Also give Appendix A.2 a lead-in sentence: its only content was a figure,
so the heading rendered bare against the Appendix B heading.

Co-Authored-By: Claude Opus 4.8 <noreply@anthropic.com>
</commit_message>
<xml_diff>
--- a/docs/nomas-2col.docx
+++ b/docs/nomas-2col.docx
@@ -16237,6 +16237,21 @@
           <w:color w:val="000000"/>
         </w:rPr>
         <w:t xml:space="preserve">A.2 Per-dataset predicted-versus-true rank</w:t>
+      </w:r>
+    </w:p>
+    <w:p>
+      <w:pPr>
+        <w:pStyle w:val="FirstParagraph"/>
+        <w:jc w:val="both"/>
+        <w:keepNext w:val="0"/>
+        <w:keepLines w:val="0"/>
+        <w:widowControl w:val="1"/>
+      </w:pPr>
+      <w:r>
+        <w:rPr>
+          <w:color w:val="000000"/>
+        </w:rPr>
+        <w:t xml:space="preserve">The per-dataset view shows where the aggregate signal comes from. Figure A.1 plots NoMaS-predicted rank against true rank for every detector, one panel per dataset: the datasets whose scatter tracks the identity line carry the bulk of the signal, while those with saturated true AUC contribute noise-dominated tie-breaking.</w:t>
       </w:r>
     </w:p>
     <w:p>

</xml_diff>